<commit_message>
Orthodox Symbols 0.2.001 (pre-release): add no-warranty sentence to the License section
</commit_message>
<xml_diff>
--- a/OrthodoxSymbols_Guide.docx
+++ b/OrthodoxSymbols_Guide.docx
@@ -43,7 +43,7 @@
           <w:color w:val="555555"/>
           <w:sz w:val="18"/>
         </w:rPr>
-        <w:t>A symbol font for liturgical documents  ·  Version 0.2.000 PRE-RELEASE  ·  Copyright 2026 Alan Fahrner, with Reserved Font Name "Orthodox Symbols"  ·  SIL Open Font License 1.1</w:t>
+        <w:t>A symbol font for liturgical documents  ·  Version 0.2.001 PRE-RELEASE  ·  Copyright 2026 Alan Fahrner, with Reserved Font Name "Orthodox Symbols"  ·  SIL Open Font License 1.1</w:t>
       </w:r>
     </w:p>
     <w:p>
@@ -91,7 +91,7 @@
                 <w:color w:val="B00000"/>
                 <w:sz w:val="30"/>
               </w:rPr>
-              <w:t>PRE-RELEASE  ·  Version 0.2.000  ·  NOT FINAL</w:t>
+              <w:t>PRE-RELEASE  ·  Version 0.2.001  ·  NOT FINAL</w:t>
             </w:r>
           </w:p>
           <w:p>
@@ -5558,6 +5558,15 @@
       <w:r>
         <w:rPr>
           <w:rFonts w:ascii="Georgia" w:hAnsi="Georgia" w:cs="Georgia" w:eastAsia="Georgia"/>
+          <w:sz w:val="19"/>
+        </w:rPr>
+        <w:t>This font is a free pre-release, provided as is, without warranty. See OFL.txt for the full terms.</w:t>
+      </w:r>
+    </w:p>
+    <w:p>
+      <w:r>
+        <w:rPr>
+          <w:rFonts w:ascii="Georgia" w:hAnsi="Georgia" w:cs="Georgia" w:eastAsia="Georgia"/>
           <w:i/>
           <w:sz w:val="19"/>
         </w:rPr>

</xml_diff>

<commit_message>
Orthodox Symbols 0.3.000 (pre-release): adds missal and two chasubles; symbol locations are fixed
</commit_message>
<xml_diff>
--- a/OrthodoxSymbols_Guide.docx
+++ b/OrthodoxSymbols_Guide.docx
@@ -43,7 +43,7 @@
           <w:color w:val="555555"/>
           <w:sz w:val="18"/>
         </w:rPr>
-        <w:t>A symbol font for liturgical documents  ·  Version 0.2.001 PRE-RELEASE  ·  Copyright 2026 Alan Fahrner, with Reserved Font Name "Orthodox Symbols"  ·  SIL Open Font License 1.1</w:t>
+        <w:t>A symbol font for liturgical documents  ·  Version 0.3.000 PRE-RELEASE  ·  Copyright 2026 Alan Fahrner, with Reserved Font Name "Orthodox Symbols"  ·  SIL Open Font License 1.1</w:t>
       </w:r>
     </w:p>
     <w:p>
@@ -91,7 +91,7 @@
                 <w:color w:val="B00000"/>
                 <w:sz w:val="30"/>
               </w:rPr>
-              <w:t>PRE-RELEASE  ·  Version 0.2.001  ·  NOT FINAL</w:t>
+              <w:t>PRE-RELEASE  ·  Version 0.3.000</w:t>
             </w:r>
           </w:p>
           <w:p>
@@ -102,7 +102,7 @@
                 <w:color w:val="B00000"/>
                 <w:sz w:val="24"/>
               </w:rPr>
-              <w:t>During this pre-release stage we may change or remove any symbol.</w:t>
+              <w:t>Symbol locations are fixed: once a symbol is assigned to a key, it will not move, so documents you create will keep working.</w:t>
             </w:r>
           </w:p>
           <w:p>
@@ -115,7 +115,7 @@
                 <w:b/>
                 <w:sz w:val="20"/>
               </w:rPr>
-              <w:t>This is a pre-release test version shared for feedback. Existing symbols may be redrawn, replaced or removed, and key assignments and private-use codes may be changed or remapped as feedback arrives. The font's author reserves the right to do so. Documents made with this version may look different after you install a later version. Assignments will be frozen only at version 1.0; until then, nothing is guaranteed to stay the same.</w:t>
+              <w:t>New symbols are added only on unused keys. A symbol may be removed if church authority judges it inappropriate. This is still a pre-release shared for feedback: some drawings may be refined, but a symbol keeps its key and its private-use code.</w:t>
             </w:r>
           </w:p>
         </w:tc>
@@ -147,7 +147,7 @@
           <w:color w:val="B00000"/>
           <w:sz w:val="19"/>
         </w:rPr>
-        <w:t xml:space="preserve"> (key B) is experimental: a rough drawing traced from Alan's icon reference. It may change or be removed in a future version, so please don't depend on it.</w:t>
+        <w:t xml:space="preserve"> (key B) is experimental: a rough drawing traced from Alan's icon reference. Its drawing may be refined in a future version, but it stays on key B (U+E0AB).</w:t>
       </w:r>
     </w:p>
     <w:p/>
@@ -203,7 +203,7 @@
                 <w:rFonts w:ascii="Georgia" w:hAnsi="Georgia" w:cs="Georgia" w:eastAsia="Georgia"/>
                 <w:sz w:val="20"/>
               </w:rPr>
-              <w:t xml:space="preserve"> instead of a symbol. The font's author reserves the right to map any of these keys to a new symbol in a future version. Do not use unlisted keys for ordinary text: a document that does may show different symbols after a font update. During the pre-release (before 1.0), listed keys may also change. From version 1.0 on, listed keys will never change.</w:t>
+              <w:t xml:space="preserve"> instead of a symbol. The font's author reserves the right to map any of these keys to a new symbol in a future version. Do not use unlisted keys for ordinary text: a document that does may show different symbols after a font update. Listed keys never change: once a symbol is assigned to a key, it will not move.</w:t>
             </w:r>
           </w:p>
         </w:tc>
@@ -392,7 +392,7 @@
         <w:rPr>
           <w:rFonts w:ascii="Georgia" w:hAnsi="Georgia" w:cs="Georgia" w:eastAsia="Georgia"/>
         </w:rPr>
-        <w:t xml:space="preserve"> (experimental: it may change or be removed), / gives kneel </w:t>
+        <w:t xml:space="preserve"> (experimental drawing; its key stays B), / gives kneel </w:t>
       </w:r>
       <w:r>
         <w:rPr>
@@ -818,7 +818,7 @@
         <w:rPr>
           <w:rFonts w:ascii="Georgia" w:hAnsi="Georgia" w:cs="Georgia" w:eastAsia="Georgia"/>
         </w:rPr>
-        <w:t>11.  Private-use codes (U+E000 and up, grouped like the chart) are the stable address of each symbol: Insert &gt; Symbol &gt; Orthodox Symbols, or type the code and press Alt+X in Word for Windows. During the pre-release, codes may still change too.</w:t>
+        <w:t>11.  Private-use codes (U+E000 and up, grouped like the chart) are the stable address of each symbol: Insert &gt; Symbol &gt; Orthodox Symbols, or type the code and press Alt+X in Word for Windows. Keys and codes are fixed: a symbol never moves once assigned.</w:t>
       </w:r>
     </w:p>
     <w:p>
@@ -863,7 +863,7 @@
           <w:color w:val="B00000"/>
           <w:sz w:val="18"/>
         </w:rPr>
-        <w:t>Pre-release: symbols, keys and private-use codes may still change before 1.0. Keep the copy you uploaded, and read the notes of any newer version before you replace it.</w:t>
+        <w:t>Pre-release: symbol keys and private-use codes are fixed, so pages keep working when you update; some drawings may still be refined. Read the notes of any newer version before you replace your copy.</w:t>
       </w:r>
     </w:p>
     <w:p>
@@ -1105,7 +1105,7 @@
         <w:rPr>
           <w:rFonts w:ascii="Georgia" w:hAnsi="Georgia" w:cs="Georgia" w:eastAsia="Georgia"/>
         </w:rPr>
-        <w:t>, is written &amp;#xE02D;). Codes are the stable address of each symbol: if a key ever moves, the code stays. While the font loads, or if it fails, a code shows as nothing or an empty box rather than a wrong letter.</w:t>
+        <w:t>, is written &amp;#xE02D;). Codes are the stable address of each symbol, and keys are fixed too. While the font loads, or if it fails, a code shows as nothing or an empty box rather than a wrong letter.</w:t>
       </w:r>
     </w:p>
     <w:p>
@@ -1735,7 +1735,7 @@
           <w:color w:val="555555"/>
           <w:sz w:val="16"/>
         </w:rPr>
-        <w:t xml:space="preserve">   U+E020 to U+E05F  ·  keys: mnemonic letters (lowercase = outline, Shift = filled)</w:t>
+        <w:t xml:space="preserve">   U+E020 to U+E05F  ·  keys: mnemonic letters, plus ` ~ for the chasubles (lowercase = outline, Shift = filled)</w:t>
       </w:r>
     </w:p>
     <w:tbl>
@@ -2594,6 +2594,167 @@
               <w:t>Bible  U+E033</w:t>
             </w:r>
           </w:p>
+        </w:tc>
+      </w:tr>
+      <w:tr>
+        <w:trPr>
+          <w:cantSplit/>
+        </w:trPr>
+        <w:tc>
+          <w:tcPr>
+            <w:tcW w:type="dxa" w:w="1699"/>
+          </w:tcPr>
+          <w:p>
+            <w:pPr>
+              <w:spacing w:before="80" w:after="0"/>
+              <w:jc w:val="center"/>
+            </w:pPr>
+            <w:r>
+              <w:rPr>
+                <w:rFonts w:ascii="Orthodox Symbols" w:hAnsi="Orthodox Symbols" w:cs="Orthodox Symbols" w:eastAsia="Orthodox Symbols"/>
+                <w:sz w:val="56"/>
+              </w:rPr>
+              <w:t>m</w:t>
+            </w:r>
+          </w:p>
+          <w:p>
+            <w:pPr>
+              <w:spacing w:after="0"/>
+              <w:jc w:val="center"/>
+            </w:pPr>
+            <w:r>
+              <w:rPr>
+                <w:rFonts w:ascii="Courier New" w:hAnsi="Courier New" w:cs="Courier New" w:eastAsia="Courier New"/>
+                <w:b/>
+                <w:sz w:val="24"/>
+              </w:rPr>
+              <w:t>m</w:t>
+            </w:r>
+          </w:p>
+          <w:p>
+            <w:pPr>
+              <w:spacing w:after="40"/>
+              <w:jc w:val="center"/>
+            </w:pPr>
+            <w:r>
+              <w:rPr>
+                <w:rFonts w:ascii="Georgia" w:hAnsi="Georgia" w:cs="Georgia" w:eastAsia="Georgia"/>
+                <w:color w:val="555555"/>
+                <w:sz w:val="13"/>
+              </w:rPr>
+              <w:t>Missal  U+E035</w:t>
+            </w:r>
+          </w:p>
+        </w:tc>
+        <w:tc>
+          <w:tcPr>
+            <w:tcW w:type="dxa" w:w="1699"/>
+          </w:tcPr>
+          <w:p>
+            <w:pPr>
+              <w:spacing w:before="80" w:after="0"/>
+              <w:jc w:val="center"/>
+            </w:pPr>
+            <w:r>
+              <w:rPr>
+                <w:rFonts w:ascii="Orthodox Symbols" w:hAnsi="Orthodox Symbols" w:cs="Orthodox Symbols" w:eastAsia="Orthodox Symbols"/>
+                <w:sz w:val="56"/>
+              </w:rPr>
+              <w:t>~</w:t>
+            </w:r>
+          </w:p>
+          <w:p>
+            <w:pPr>
+              <w:spacing w:after="0"/>
+              <w:jc w:val="center"/>
+            </w:pPr>
+            <w:r>
+              <w:rPr>
+                <w:rFonts w:ascii="Courier New" w:hAnsi="Courier New" w:cs="Courier New" w:eastAsia="Courier New"/>
+                <w:b/>
+                <w:sz w:val="24"/>
+              </w:rPr>
+              <w:t>~</w:t>
+            </w:r>
+          </w:p>
+          <w:p>
+            <w:pPr>
+              <w:spacing w:after="40"/>
+              <w:jc w:val="center"/>
+            </w:pPr>
+            <w:r>
+              <w:rPr>
+                <w:rFonts w:ascii="Georgia" w:hAnsi="Georgia" w:cs="Georgia" w:eastAsia="Georgia"/>
+                <w:color w:val="555555"/>
+                <w:sz w:val="13"/>
+              </w:rPr>
+              <w:t>Chasuble (cross)  U+E037</w:t>
+            </w:r>
+          </w:p>
+        </w:tc>
+        <w:tc>
+          <w:tcPr>
+            <w:tcW w:type="dxa" w:w="1699"/>
+          </w:tcPr>
+          <w:p>
+            <w:pPr>
+              <w:spacing w:before="80" w:after="0"/>
+              <w:jc w:val="center"/>
+            </w:pPr>
+            <w:r>
+              <w:rPr>
+                <w:rFonts w:ascii="Orthodox Symbols" w:hAnsi="Orthodox Symbols" w:cs="Orthodox Symbols" w:eastAsia="Orthodox Symbols"/>
+                <w:sz w:val="56"/>
+              </w:rPr>
+              <w:t>`</w:t>
+            </w:r>
+          </w:p>
+          <w:p>
+            <w:pPr>
+              <w:spacing w:after="0"/>
+              <w:jc w:val="center"/>
+            </w:pPr>
+            <w:r>
+              <w:rPr>
+                <w:rFonts w:ascii="Courier New" w:hAnsi="Courier New" w:cs="Courier New" w:eastAsia="Courier New"/>
+                <w:b/>
+                <w:sz w:val="24"/>
+              </w:rPr>
+              <w:t>`</w:t>
+            </w:r>
+          </w:p>
+          <w:p>
+            <w:pPr>
+              <w:spacing w:after="40"/>
+              <w:jc w:val="center"/>
+            </w:pPr>
+            <w:r>
+              <w:rPr>
+                <w:rFonts w:ascii="Georgia" w:hAnsi="Georgia" w:cs="Georgia" w:eastAsia="Georgia"/>
+                <w:color w:val="555555"/>
+                <w:sz w:val="13"/>
+              </w:rPr>
+              <w:t>Chasuble (band)  U+E039</w:t>
+            </w:r>
+          </w:p>
+        </w:tc>
+        <w:tc>
+          <w:tcPr>
+            <w:tcW w:type="dxa" w:w="1704"/>
+          </w:tcPr>
+          <w:p/>
+        </w:tc>
+        <w:tc>
+          <w:tcPr>
+            <w:tcW w:type="dxa" w:w="1704"/>
+          </w:tcPr>
+          <w:p/>
+        </w:tc>
+        <w:tc>
+          <w:tcPr>
+            <w:tcW w:type="dxa" w:w="1704"/>
+          </w:tcPr>
+          <w:p/>
         </w:tc>
       </w:tr>
     </w:tbl>
@@ -3833,7 +3994,7 @@
                 <w:color w:val="555555"/>
                 <w:sz w:val="13"/>
               </w:rPr>
-              <w:t>Blessing hand (experimental; may change or be removed)  U+E0AB</w:t>
+              <w:t>Blessing hand (experimental drawing)  U+E0AB</w:t>
             </w:r>
           </w:p>
         </w:tc>
@@ -4719,7 +4880,7 @@
           <w:rFonts w:ascii="Orthodox Symbols" w:hAnsi="Orthodox Symbols" w:cs="Orthodox Symbols" w:eastAsia="Orthodox Symbols"/>
           <w:sz w:val="20"/>
         </w:rPr>
-        <w:t>1 ! 2 @ 3 # 4 $ 5 % w W e E c C d D u U a A l L h H G N - _ = + [ { ] } ; : ' " , &lt; . &gt; / I X P O M B j S Q V R k K t T z Z f y Y</w:t>
+        <w:t>1 ! 2 @ 3 # 4 $ 5 % w W e E c C d D u U a A l L h H G N m ~ ` - _ = + [ { ] } ; : ' " , &lt; . &gt; / I X P O M B j S Q V R k K t T z Z f y Y</w:t>
       </w:r>
     </w:p>
     <w:p>
@@ -4744,7 +4905,7 @@
           <w:rFonts w:ascii="Orthodox Symbols" w:hAnsi="Orthodox Symbols" w:cs="Orthodox Symbols" w:eastAsia="Orthodox Symbols"/>
           <w:sz w:val="28"/>
         </w:rPr>
-        <w:t>1 ! 2 @ 3 # 4 $ 5 % w W e E c C d D u U a A l L h H G N - _ = + [ { ] } ; : ' " , &lt; . &gt; / I X P O M B j S Q V R k K t T z Z f y Y</w:t>
+        <w:t>1 ! 2 @ 3 # 4 $ 5 % w W e E c C d D u U a A l L h H G N m ~ ` - _ = + [ { ] } ; : ' " , &lt; . &gt; / I X P O M B j S Q V R k K t T z Z f y Y</w:t>
       </w:r>
     </w:p>
     <w:p>

</xml_diff>